<commit_message>
Schritt 3: Papierlernweg und Kompetenzcheck mit konkreten nächsten Lernschritten
</commit_message>
<xml_diff>
--- a/materialien/arbeitsblaetter/Mein_Lernweg.docx
+++ b/materialien/arbeitsblaetter/Mein_Lernweg.docx
@@ -4,1270 +4,369 @@
   <w:body>
     <w:p>
       <w:pPr>
-        <w:spacing w:after="0"/>
-        <w:keepLines/>
-        <w:keepNext/>
+        <w:pStyle w:val="Title"/>
+        <w:pageBreakBefore w:val="0"/>
       </w:pPr>
       <w:r>
-        <w:rPr>
-          <w:rFonts w:ascii="Aptos" w:hAnsi="Aptos"/>
-          <w:b/>
-          <w:color w:val="3E5668"/>
-          <w:sz w:val="48"/>
-        </w:rPr>
-        <w:t>Mein Lernweg</w:t>
+        <w:t>Mein Lernweg · Wunschbriefe</w:t>
+      </w:r>
+    </w:p>
+    <w:p>
+      <w:r>
+        <w:t>Name: _______________________________________</w:t>
       </w:r>
     </w:p>
     <w:p>
       <w:pPr>
-        <w:spacing w:before="0" w:after="140"/>
-        <w:keepLines/>
-        <w:keepNext/>
+        <w:shd w:fill="EEF2F4"/>
       </w:pPr>
       <w:r>
         <w:rPr>
           <w:b/>
-          <w:color w:val="D97A4A"/>
-          <w:sz w:val="36"/>
         </w:rPr>
-        <w:t>Unsere Wünsche für die neue Schule</w:t>
+        <w:t xml:space="preserve">Dein Ziel: </w:t>
+      </w:r>
+      <w:r>
+        <w:t>Du schreibst einen freundlichen und verständlichen Brief mit einem Wunsch für die Schule.</w:t>
+      </w:r>
+    </w:p>
+    <w:p>
+      <w:r>
+        <w:t>Input → Übung → Vertiefung → Probearbeit → Projekte → Lernerfolgskontrolle (Arbeit)</w:t>
+      </w:r>
+    </w:p>
+    <w:p>
+      <w:r>
+        <w:t>Input heißt: Du bekommst eine Erklärung. Vertiefung und Projekte sind freiwillig. Die Probearbeit ist ohne Note.</w:t>
+      </w:r>
+    </w:p>
+    <w:p>
+      <w:pPr>
+        <w:shd w:fill="EEF2F4"/>
+      </w:pPr>
+      <w:r>
+        <w:rPr>
+          <w:b/>
+        </w:rPr>
+        <w:t xml:space="preserve">So nutzt du den Lernweg: </w:t>
+      </w:r>
+      <w:r>
+        <w:t>Kreise dein nächstes Blatt ein. Hake ab, was du bearbeitet und geprüft hast. Ein Haken zeigt: erledigt. Er zeigt noch nicht: sicher gekonnt.</w:t>
+      </w:r>
+    </w:p>
+    <w:p>
+      <w:r>
+        <w:t>Planung: Wähle ein Blatt. Durchführung: Bearbeite es.</w:t>
+        <w:br/>
+        <w:t>Reflexion: Prüfe dein Ergebnis. Wähle den nächsten Schritt.</w:t>
+      </w:r>
+    </w:p>
+    <w:p>
+      <w:pPr>
+        <w:pStyle w:val="Heading1"/>
+      </w:pPr>
+      <w:r>
+        <w:t>Deine Übungen · Blätter 1–12</w:t>
       </w:r>
     </w:p>
     <w:p>
       <w:pPr>
         <w:spacing w:after="140"/>
-        <w:pBdr>
-          <w:bottom w:val="single" w:sz="4" w:space="4" w:color="CED7DC"/>
-        </w:pBdr>
       </w:pPr>
       <w:r>
-        <w:rPr>
-          <w:b/>
-          <w:color w:val="3E5668"/>
-          <w:sz w:val="25"/>
-        </w:rPr>
-        <w:t xml:space="preserve">Name: </w:t>
-      </w:r>
-      <w:r>
-        <w:t>______________________________________________</w:t>
-      </w:r>
-    </w:p>
-    <w:p>
-      <w:pPr>
-        <w:spacing w:before="20" w:after="140" w:line="252" w:lineRule="auto"/>
-        <w:ind w:left="85" w:right="85"/>
-        <w:shd w:fill="EDF2F5"/>
-        <w:pBdr>
-          <w:top w:val="single" w:sz="7" w:space="3" w:color="3E5668"/>
-          <w:bottom w:val="single" w:sz="5" w:space="3" w:color="3E5668"/>
-        </w:pBdr>
-        <w:keepLines/>
-      </w:pPr>
-      <w:r>
-        <w:rPr>
-          <w:b/>
-          <w:color w:val="3E5668"/>
-          <w:sz w:val="26"/>
-        </w:rPr>
-        <w:t>Ziel der Reihe</w:t>
-        <w:br/>
-      </w:r>
-      <w:r>
-        <w:rPr>
-          <w:sz w:val="26"/>
-        </w:rPr>
-        <w:t>Ich kann einen vollständigen Brief schreiben und darin einen Wunsch für unseren Schulalltag freundlich und verständlich äußern.</w:t>
-      </w:r>
-    </w:p>
-    <w:p>
-      <w:pPr>
-        <w:spacing w:after="60"/>
-        <w:keepLines/>
-        <w:keepNext/>
-      </w:pPr>
-      <w:r>
-        <w:rPr>
-          <w:b/>
-          <w:color w:val="3E5668"/>
-          <w:sz w:val="26"/>
-        </w:rPr>
-        <w:t>Das bedeuten die Zeichen auf deinen Arbeitsblättern</w:t>
-      </w:r>
-    </w:p>
-    <w:p>
-      <w:pPr>
-        <w:spacing w:after="40"/>
-        <w:ind w:left="85" w:right="85"/>
-        <w:shd w:fill="FBE9DE"/>
-        <w:keepLines/>
-      </w:pPr>
-      <w:r>
-        <w:rPr>
-          <w:rFonts w:ascii="Segoe UI Emoji" w:hAnsi="Segoe UI Emoji"/>
-          <w:sz w:val="25"/>
-        </w:rPr>
-        <w:t xml:space="preserve">✏ </w:t>
-      </w:r>
-      <w:r>
-        <w:rPr>
-          <w:b/>
-          <w:color w:val="D97A4A"/>
-          <w:sz w:val="25"/>
-        </w:rPr>
-        <w:t xml:space="preserve">Aufgabe: </w:t>
-      </w:r>
-      <w:r>
-        <w:rPr>
-          <w:sz w:val="25"/>
-        </w:rPr>
-        <w:t>Das bearbeitest du.</w:t>
-      </w:r>
-    </w:p>
-    <w:p>
-      <w:pPr>
-        <w:spacing w:after="40"/>
-        <w:ind w:left="85" w:right="85"/>
-        <w:shd w:fill="EAF4E7"/>
-        <w:keepLines/>
-      </w:pPr>
-      <w:r>
-        <w:rPr>
-          <w:rFonts w:ascii="Segoe UI Emoji" w:hAnsi="Segoe UI Emoji"/>
-          <w:sz w:val="25"/>
-        </w:rPr>
-        <w:t xml:space="preserve">💡 </w:t>
-      </w:r>
-      <w:r>
-        <w:rPr>
-          <w:b/>
-          <w:color w:val="7DBB6F"/>
-          <w:sz w:val="25"/>
-        </w:rPr>
-        <w:t xml:space="preserve">Tipp: </w:t>
-      </w:r>
-      <w:r>
-        <w:rPr>
-          <w:sz w:val="25"/>
-        </w:rPr>
-        <w:t>Hier findest du eine Hilfe.</w:t>
-      </w:r>
-    </w:p>
-    <w:p>
-      <w:pPr>
-        <w:spacing w:after="40"/>
-        <w:ind w:left="85" w:right="85"/>
-        <w:shd w:fill="FFF4D5"/>
-        <w:keepLines/>
-      </w:pPr>
-      <w:r>
-        <w:rPr>
-          <w:rFonts w:ascii="Segoe UI Emoji" w:hAnsi="Segoe UI Emoji"/>
-          <w:sz w:val="25"/>
-        </w:rPr>
-        <w:t xml:space="preserve">👀 </w:t>
-      </w:r>
-      <w:r>
-        <w:rPr>
-          <w:b/>
-          <w:color w:val="C58A00"/>
-          <w:sz w:val="25"/>
-        </w:rPr>
-        <w:t xml:space="preserve">Beispiel: </w:t>
-      </w:r>
-      <w:r>
-        <w:rPr>
-          <w:sz w:val="25"/>
-        </w:rPr>
-        <w:t>Hier siehst du eine mögliche Formulierung.</w:t>
-      </w:r>
-    </w:p>
-    <w:p>
-      <w:pPr>
-        <w:spacing w:before="40" w:after="40"/>
-        <w:ind w:left="85" w:right="85"/>
-        <w:shd w:fill="F7F7F7"/>
-        <w:pBdr>
-          <w:top w:val="single" w:sz="5" w:space="3" w:color="D97A4A"/>
-        </w:pBdr>
-        <w:keepLines/>
-        <w:keepNext/>
-      </w:pPr>
-      <w:r>
-        <w:rPr>
-          <w:b/>
-          <w:color w:val="D97A4A"/>
-          <w:sz w:val="25"/>
-        </w:rPr>
-        <w:t>Dein Lernweg</w:t>
-      </w:r>
-    </w:p>
-    <w:p>
-      <w:pPr>
-        <w:spacing w:after="30"/>
-        <w:ind w:left="227" w:right="85"/>
-        <w:shd w:fill="F7F7F7"/>
-        <w:keepLines/>
-      </w:pPr>
-      <w:r>
-        <w:rPr>
-          <w:rFonts w:ascii="Aptos" w:hAnsi="Aptos"/>
-          <w:color w:val="222222"/>
-          <w:sz w:val="25"/>
-        </w:rPr>
-        <w:t xml:space="preserve">•  </w:t>
-      </w:r>
-      <w:r>
-        <w:rPr>
-          <w:color w:val="222222"/>
-          <w:sz w:val="25"/>
-        </w:rPr>
-        <w:t>Blätter ohne Zusatzzeichen gehören zum Lernweg für alle.</w:t>
-      </w:r>
-    </w:p>
-    <w:p>
-      <w:pPr>
-        <w:spacing w:after="30"/>
-        <w:ind w:left="227" w:right="85"/>
-        <w:shd w:fill="F7F7F7"/>
-        <w:keepLines/>
-      </w:pPr>
-      <w:r>
-        <w:rPr>
-          <w:rFonts w:ascii="Segoe UI Emoji" w:hAnsi="Segoe UI Emoji"/>
-          <w:color w:val="D97A4A"/>
-          <w:sz w:val="25"/>
-        </w:rPr>
-        <w:t xml:space="preserve">🔼  </w:t>
-      </w:r>
-      <w:r>
-        <w:rPr>
-          <w:b/>
-          <w:color w:val="D97A4A"/>
-          <w:sz w:val="25"/>
-        </w:rPr>
-        <w:t>Noch einen Schritt – freiwillig.</w:t>
+        <w:t>☐  Blatt 1   Unsere Wünsche für die neue Schule</w:t>
       </w:r>
     </w:p>
     <w:p>
       <w:pPr>
         <w:spacing w:after="140"/>
-        <w:ind w:left="227" w:right="85"/>
-        <w:shd w:fill="F7F7F7"/>
-        <w:keepLines/>
-        <w:pBdr>
-          <w:bottom w:val="single" w:sz="5" w:space="3" w:color="D97A4A"/>
-        </w:pBdr>
       </w:pPr>
       <w:r>
-        <w:rPr>
-          <w:rFonts w:ascii="Segoe UI Emoji" w:hAnsi="Segoe UI Emoji"/>
-          <w:color w:val="C58A00"/>
-          <w:sz w:val="25"/>
-        </w:rPr>
-        <w:t xml:space="preserve">⭐  </w:t>
-      </w:r>
-      <w:r>
-        <w:rPr>
-          <w:b/>
-          <w:color w:val="C58A00"/>
-          <w:sz w:val="25"/>
-        </w:rPr>
-        <w:t>Für Entdecker – freiwillig.</w:t>
+        <w:t>☐  Blatt 2   Mein Lernweg</w:t>
       </w:r>
     </w:p>
     <w:p>
       <w:pPr>
-        <w:spacing w:before="20" w:after="60"/>
-        <w:keepLines/>
-        <w:keepNext/>
+        <w:spacing w:after="140"/>
+      </w:pPr>
+      <w:r>
+        <w:t>☐  Blatt 3   Wünsche für unsere Schule</w:t>
+      </w:r>
+    </w:p>
+    <w:p>
+      <w:pPr>
+        <w:spacing w:after="140"/>
+      </w:pPr>
+      <w:r>
+        <w:t>☐  Blatt 4   Wer schreibt wem?</w:t>
+      </w:r>
+    </w:p>
+    <w:p>
+      <w:pPr>
+        <w:spacing w:after="140"/>
+      </w:pPr>
+      <w:r>
+        <w:t>☐  Blatt 5   Wer kann dabei helfen?</w:t>
+      </w:r>
+    </w:p>
+    <w:p>
+      <w:pPr>
+        <w:spacing w:after="140"/>
+      </w:pPr>
+      <w:r>
+        <w:t>☐  Blatt 6   Was ist der Wunsch?</w:t>
+      </w:r>
+    </w:p>
+    <w:p>
+      <w:pPr>
+        <w:spacing w:after="140"/>
+      </w:pPr>
+      <w:r>
+        <w:t>☐  Blatt 7   Die Teile eines Briefes</w:t>
+      </w:r>
+    </w:p>
+    <w:p>
+      <w:pPr>
+        <w:spacing w:after="140"/>
+      </w:pPr>
+      <w:r>
+        <w:t>☐  Blatt 8   Das Briefpuzzle</w:t>
+      </w:r>
+    </w:p>
+    <w:p>
+      <w:pPr>
+        <w:spacing w:after="140"/>
+      </w:pPr>
+      <w:r>
+        <w:t>☐  Blatt 9   Anrede und Grußformel</w:t>
+      </w:r>
+    </w:p>
+    <w:p>
+      <w:pPr>
+        <w:spacing w:after="140"/>
+      </w:pPr>
+      <w:r>
+        <w:t>☐  Blatt 10   Fehlerwerkstatt Briefaufbau</w:t>
+      </w:r>
+    </w:p>
+    <w:p>
+      <w:pPr>
+        <w:spacing w:after="140"/>
+      </w:pPr>
+      <w:r>
+        <w:t>☐  Blatt 11   Freundlich und genau</w:t>
+      </w:r>
+    </w:p>
+    <w:p>
+      <w:pPr>
+        <w:spacing w:after="140"/>
+      </w:pPr>
+      <w:r>
+        <w:t>☐  Blatt 12   Satzstarter für Wunschbriefe</w:t>
+      </w:r>
+    </w:p>
+    <w:p>
+      <w:pPr>
+        <w:shd w:fill="EEF2F4"/>
       </w:pPr>
       <w:r>
         <w:rPr>
           <w:b/>
-          <w:color w:val="3E5668"/>
-          <w:sz w:val="28"/>
         </w:rPr>
-        <w:t>Blätter 1–12</w:t>
+        <w:t xml:space="preserve">Halt nach Blatt 12: </w:t>
+      </w:r>
+      <w:r>
+        <w:t>Zeige an einem Beispiel: Anrede, Wunsch und Grußformel. Unsicher? Übe mit Blatt 7, 9 oder 12 und frage nach Hilfe.</w:t>
+      </w:r>
+    </w:p>
+    <w:p>
+      <w:r>
+        <w:t>Aufgabe: Das tust du. Hilfe: Das unterstützt dich.</w:t>
+        <w:br/>
+        <w:t>Beispiel: So kann es aussehen. Prüfe: Daran erkennst du dein Ergebnis.</w:t>
       </w:r>
     </w:p>
     <w:p>
       <w:pPr>
-        <w:spacing w:before="0" w:after="100" w:line="240" w:lineRule="auto"/>
-        <w:ind w:left="57" w:right="57"/>
-        <w:keepLines/>
-        <w:pBdr>
-          <w:bottom w:val="single" w:sz="4" w:space="3" w:color="CED7DC"/>
-        </w:pBdr>
+        <w:pStyle w:val="Title"/>
+        <w:pageBreakBefore/>
       </w:pPr>
       <w:r>
-        <w:rPr>
-          <w:rFonts w:ascii="Aptos" w:hAnsi="Aptos"/>
-          <w:color w:val="222222"/>
-          <w:sz w:val="28"/>
-        </w:rPr>
-        <w:t xml:space="preserve">☐  </w:t>
-      </w:r>
-      <w:r>
-        <w:rPr>
-          <w:b/>
-          <w:color w:val="3E5668"/>
-          <w:sz w:val="28"/>
-        </w:rPr>
-        <w:t>Blatt 1</w:t>
-      </w:r>
-      <w:r>
-        <w:rPr>
-          <w:color w:val="222222"/>
-          <w:sz w:val="28"/>
-        </w:rPr>
-        <w:t xml:space="preserve">  Unsere Wünsche für die neue Schule</w:t>
+        <w:t>Mein Lernweg · weiter geht’s</w:t>
       </w:r>
     </w:p>
     <w:p>
       <w:pPr>
-        <w:spacing w:before="0" w:after="100" w:line="240" w:lineRule="auto"/>
-        <w:ind w:left="57" w:right="57"/>
-        <w:keepLines/>
-        <w:pBdr>
-          <w:bottom w:val="single" w:sz="4" w:space="3" w:color="CED7DC"/>
-        </w:pBdr>
+        <w:pStyle w:val="Heading1"/>
       </w:pPr>
       <w:r>
-        <w:rPr>
-          <w:rFonts w:ascii="Aptos" w:hAnsi="Aptos"/>
-          <w:color w:val="222222"/>
-          <w:sz w:val="28"/>
-        </w:rPr>
-        <w:t xml:space="preserve">☐  </w:t>
-      </w:r>
-      <w:r>
-        <w:rPr>
-          <w:b/>
-          <w:color w:val="3E5668"/>
-          <w:sz w:val="28"/>
-        </w:rPr>
-        <w:t>Blatt 2</w:t>
-      </w:r>
-      <w:r>
-        <w:rPr>
-          <w:color w:val="222222"/>
-          <w:sz w:val="28"/>
-        </w:rPr>
-        <w:t xml:space="preserve">  Mein Lernweg</w:t>
+        <w:t>Deine Übungen · Blätter 13–24</w:t>
       </w:r>
     </w:p>
     <w:p>
       <w:pPr>
-        <w:spacing w:before="0" w:after="100" w:line="240" w:lineRule="auto"/>
-        <w:ind w:left="57" w:right="57"/>
-        <w:keepLines/>
-        <w:pBdr>
-          <w:bottom w:val="single" w:sz="4" w:space="3" w:color="CED7DC"/>
-        </w:pBdr>
+        <w:spacing w:after="160"/>
       </w:pPr>
       <w:r>
-        <w:rPr>
-          <w:rFonts w:ascii="Aptos" w:hAnsi="Aptos"/>
-          <w:color w:val="222222"/>
-          <w:sz w:val="28"/>
-        </w:rPr>
-        <w:t xml:space="preserve">☐  </w:t>
-      </w:r>
-      <w:r>
-        <w:rPr>
-          <w:b/>
-          <w:color w:val="3E5668"/>
-          <w:sz w:val="28"/>
-        </w:rPr>
-        <w:t>Blatt 3</w:t>
-      </w:r>
-      <w:r>
-        <w:rPr>
-          <w:color w:val="222222"/>
-          <w:sz w:val="28"/>
-        </w:rPr>
-        <w:t xml:space="preserve">  Wünsche für unsere Schule</w:t>
+        <w:t>☐  Blatt 13   Mein Wunsch für den Schulalltag</w:t>
       </w:r>
     </w:p>
     <w:p>
       <w:pPr>
-        <w:spacing w:before="0" w:after="100" w:line="240" w:lineRule="auto"/>
-        <w:ind w:left="57" w:right="57"/>
-        <w:keepLines/>
-        <w:pBdr>
-          <w:bottom w:val="single" w:sz="4" w:space="3" w:color="CED7DC"/>
-        </w:pBdr>
+        <w:spacing w:after="160"/>
       </w:pPr>
       <w:r>
-        <w:rPr>
-          <w:rFonts w:ascii="Aptos" w:hAnsi="Aptos"/>
-          <w:color w:val="222222"/>
-          <w:sz w:val="28"/>
-        </w:rPr>
-        <w:t xml:space="preserve">☐  </w:t>
-      </w:r>
-      <w:r>
-        <w:rPr>
-          <w:b/>
-          <w:color w:val="3E5668"/>
-          <w:sz w:val="28"/>
-        </w:rPr>
-        <w:t>Blatt 4</w:t>
-      </w:r>
-      <w:r>
-        <w:rPr>
-          <w:color w:val="222222"/>
-          <w:sz w:val="28"/>
-        </w:rPr>
-        <w:t xml:space="preserve">  Wer schreibt wem?</w:t>
+        <w:t>☐  Blatt 14   Einen Grund ergänzen · freiwillig</w:t>
       </w:r>
     </w:p>
     <w:p>
       <w:pPr>
-        <w:spacing w:before="0" w:after="100" w:line="240" w:lineRule="auto"/>
-        <w:ind w:left="57" w:right="57"/>
-        <w:keepLines/>
-        <w:pBdr>
-          <w:bottom w:val="single" w:sz="4" w:space="3" w:color="CED7DC"/>
-        </w:pBdr>
+        <w:spacing w:after="160"/>
       </w:pPr>
       <w:r>
-        <w:rPr>
-          <w:rFonts w:ascii="Aptos" w:hAnsi="Aptos"/>
-          <w:color w:val="222222"/>
-          <w:sz w:val="28"/>
-        </w:rPr>
-        <w:t xml:space="preserve">☐  </w:t>
-      </w:r>
-      <w:r>
-        <w:rPr>
-          <w:b/>
-          <w:color w:val="3E5668"/>
-          <w:sz w:val="28"/>
-        </w:rPr>
-        <w:t>Blatt 5</w:t>
-      </w:r>
-      <w:r>
-        <w:rPr>
-          <w:color w:val="222222"/>
-          <w:sz w:val="28"/>
-        </w:rPr>
-        <w:t xml:space="preserve">  Wer kann dabei helfen?</w:t>
+        <w:t>☐  Blatt 15   Auf ein Bedenken eingehen · freiwillig</w:t>
       </w:r>
     </w:p>
     <w:p>
       <w:pPr>
-        <w:spacing w:before="0" w:after="100" w:line="240" w:lineRule="auto"/>
-        <w:ind w:left="57" w:right="57"/>
-        <w:keepLines/>
-        <w:pBdr>
-          <w:bottom w:val="single" w:sz="4" w:space="3" w:color="CED7DC"/>
-        </w:pBdr>
+        <w:spacing w:after="160"/>
       </w:pPr>
       <w:r>
-        <w:rPr>
-          <w:rFonts w:ascii="Aptos" w:hAnsi="Aptos"/>
-          <w:color w:val="222222"/>
-          <w:sz w:val="28"/>
-        </w:rPr>
-        <w:t xml:space="preserve">☐  </w:t>
-      </w:r>
-      <w:r>
-        <w:rPr>
-          <w:b/>
-          <w:color w:val="3E5668"/>
-          <w:sz w:val="28"/>
-        </w:rPr>
-        <w:t>Blatt 6</w:t>
-      </w:r>
-      <w:r>
-        <w:rPr>
-          <w:color w:val="222222"/>
-          <w:sz w:val="28"/>
-        </w:rPr>
-        <w:t xml:space="preserve">  Was ist der Wunsch?</w:t>
+        <w:t>☐  Blatt 16   Mein Schreibplan</w:t>
       </w:r>
     </w:p>
     <w:p>
       <w:pPr>
-        <w:spacing w:before="0" w:after="100" w:line="240" w:lineRule="auto"/>
-        <w:ind w:left="57" w:right="57"/>
-        <w:keepLines/>
-        <w:pBdr>
-          <w:bottom w:val="single" w:sz="4" w:space="3" w:color="CED7DC"/>
-        </w:pBdr>
+        <w:spacing w:after="160"/>
       </w:pPr>
       <w:r>
-        <w:rPr>
-          <w:rFonts w:ascii="Aptos" w:hAnsi="Aptos"/>
-          <w:color w:val="222222"/>
-          <w:sz w:val="28"/>
-        </w:rPr>
-        <w:t xml:space="preserve">☐  </w:t>
-      </w:r>
-      <w:r>
-        <w:rPr>
-          <w:b/>
-          <w:color w:val="3E5668"/>
-          <w:sz w:val="28"/>
-        </w:rPr>
-        <w:t>Blatt 7</w:t>
-      </w:r>
-      <w:r>
-        <w:rPr>
-          <w:color w:val="222222"/>
-          <w:sz w:val="28"/>
-        </w:rPr>
-        <w:t xml:space="preserve">  Die Teile eines Briefes</w:t>
+        <w:t>☐  Blatt 17   Mein Briefgerüst · Hilfe bei Bedarf</w:t>
       </w:r>
     </w:p>
     <w:p>
       <w:pPr>
-        <w:spacing w:before="0" w:after="100" w:line="240" w:lineRule="auto"/>
-        <w:ind w:left="57" w:right="57"/>
-        <w:keepLines/>
-        <w:pBdr>
-          <w:bottom w:val="single" w:sz="4" w:space="3" w:color="CED7DC"/>
-        </w:pBdr>
+        <w:spacing w:after="160"/>
       </w:pPr>
       <w:r>
-        <w:rPr>
-          <w:rFonts w:ascii="Aptos" w:hAnsi="Aptos"/>
-          <w:color w:val="222222"/>
-          <w:sz w:val="28"/>
-        </w:rPr>
-        <w:t xml:space="preserve">☐  </w:t>
-      </w:r>
-      <w:r>
-        <w:rPr>
-          <w:b/>
-          <w:color w:val="3E5668"/>
-          <w:sz w:val="28"/>
-        </w:rPr>
-        <w:t>Blatt 8</w:t>
-      </w:r>
-      <w:r>
-        <w:rPr>
-          <w:color w:val="222222"/>
-          <w:sz w:val="28"/>
-        </w:rPr>
-        <w:t xml:space="preserve">  Das Briefpuzzle</w:t>
+        <w:t>☐  Blatt 18   Mein erster Wunschbrief</w:t>
       </w:r>
     </w:p>
     <w:p>
       <w:pPr>
-        <w:spacing w:before="0" w:after="100" w:line="240" w:lineRule="auto"/>
-        <w:ind w:left="57" w:right="57"/>
-        <w:keepLines/>
-        <w:pBdr>
-          <w:bottom w:val="single" w:sz="4" w:space="3" w:color="CED7DC"/>
-        </w:pBdr>
+        <w:spacing w:after="160"/>
       </w:pPr>
       <w:r>
-        <w:rPr>
-          <w:rFonts w:ascii="Aptos" w:hAnsi="Aptos"/>
-          <w:color w:val="222222"/>
-          <w:sz w:val="28"/>
-        </w:rPr>
-        <w:t xml:space="preserve">☐  </w:t>
-      </w:r>
-      <w:r>
-        <w:rPr>
-          <w:b/>
-          <w:color w:val="3E5668"/>
-          <w:sz w:val="28"/>
-        </w:rPr>
-        <w:t>Blatt 9</w:t>
-      </w:r>
-      <w:r>
-        <w:rPr>
-          <w:color w:val="222222"/>
-          <w:sz w:val="28"/>
-        </w:rPr>
-        <w:t xml:space="preserve">  Anrede und Grußformel</w:t>
+        <w:t>☐  Blatt 19   Checkliste Wunschbrief</w:t>
       </w:r>
     </w:p>
     <w:p>
       <w:pPr>
-        <w:spacing w:before="0" w:after="100" w:line="240" w:lineRule="auto"/>
-        <w:ind w:left="57" w:right="57"/>
-        <w:keepLines/>
-        <w:pBdr>
-          <w:bottom w:val="single" w:sz="4" w:space="3" w:color="CED7DC"/>
-        </w:pBdr>
+        <w:spacing w:after="160"/>
       </w:pPr>
       <w:r>
-        <w:rPr>
-          <w:rFonts w:ascii="Aptos" w:hAnsi="Aptos"/>
-          <w:color w:val="222222"/>
-          <w:sz w:val="28"/>
-        </w:rPr>
-        <w:t xml:space="preserve">☐  </w:t>
-      </w:r>
-      <w:r>
-        <w:rPr>
-          <w:b/>
-          <w:color w:val="3E5668"/>
-          <w:sz w:val="28"/>
-        </w:rPr>
-        <w:t>Blatt 10</w:t>
-      </w:r>
-      <w:r>
-        <w:rPr>
-          <w:color w:val="222222"/>
-          <w:sz w:val="28"/>
-        </w:rPr>
-        <w:t xml:space="preserve">  Fehlerwerkstatt Briefaufbau</w:t>
+        <w:t>☐  Blatt 20   Mein Brief wird besser</w:t>
       </w:r>
     </w:p>
     <w:p>
       <w:pPr>
-        <w:spacing w:before="0" w:after="100" w:line="240" w:lineRule="auto"/>
-        <w:ind w:left="57" w:right="57"/>
-        <w:keepLines/>
-        <w:pBdr>
-          <w:bottom w:val="single" w:sz="4" w:space="3" w:color="CED7DC"/>
-        </w:pBdr>
+        <w:spacing w:after="160"/>
       </w:pPr>
       <w:r>
-        <w:rPr>
-          <w:rFonts w:ascii="Aptos" w:hAnsi="Aptos"/>
-          <w:color w:val="222222"/>
-          <w:sz w:val="28"/>
-        </w:rPr>
-        <w:t xml:space="preserve">☐  </w:t>
-      </w:r>
-      <w:r>
-        <w:rPr>
-          <w:b/>
-          <w:color w:val="3E5668"/>
-          <w:sz w:val="28"/>
-        </w:rPr>
-        <w:t>Blatt 11</w:t>
-      </w:r>
-      <w:r>
-        <w:rPr>
-          <w:color w:val="222222"/>
-          <w:sz w:val="28"/>
-        </w:rPr>
-        <w:t xml:space="preserve">  Freundlich und genau</w:t>
+        <w:t>☐  Blatt 21   Meine Probearbeit · ohne Note</w:t>
       </w:r>
     </w:p>
     <w:p>
       <w:pPr>
-        <w:spacing w:before="0" w:after="100" w:line="240" w:lineRule="auto"/>
-        <w:ind w:left="57" w:right="57"/>
-        <w:keepLines/>
-        <w:pBdr>
-          <w:bottom w:val="single" w:sz="4" w:space="3" w:color="CED7DC"/>
-        </w:pBdr>
+        <w:spacing w:after="160"/>
       </w:pPr>
       <w:r>
-        <w:rPr>
-          <w:rFonts w:ascii="Aptos" w:hAnsi="Aptos"/>
-          <w:color w:val="222222"/>
-          <w:sz w:val="28"/>
-        </w:rPr>
-        <w:t xml:space="preserve">☐  </w:t>
-      </w:r>
-      <w:r>
-        <w:rPr>
-          <w:b/>
-          <w:color w:val="3E5668"/>
-          <w:sz w:val="28"/>
-        </w:rPr>
-        <w:t>Blatt 12</w:t>
-      </w:r>
-      <w:r>
-        <w:rPr>
-          <w:color w:val="222222"/>
-          <w:sz w:val="28"/>
-        </w:rPr>
-        <w:t xml:space="preserve">  Satzstarter für Wunschbriefe</w:t>
+        <w:t>☐  Blatt 22   Bin ich bereit?</w:t>
       </w:r>
     </w:p>
     <w:p>
       <w:pPr>
-        <w:pageBreakBefore/>
-      </w:pPr>
-    </w:p>
-    <w:p>
-      <w:pPr>
-        <w:spacing w:after="0"/>
-        <w:keepLines/>
-        <w:keepNext/>
+        <w:spacing w:after="160"/>
       </w:pPr>
       <w:r>
-        <w:rPr>
-          <w:rFonts w:ascii="Aptos" w:hAnsi="Aptos"/>
-          <w:b/>
-          <w:color w:val="3E5668"/>
-          <w:sz w:val="40"/>
-        </w:rPr>
-        <w:t>Mein Lernweg</w:t>
+        <w:t>☐  Blatt 23   Mein Übungsweg bis zur Arbeit</w:t>
       </w:r>
     </w:p>
     <w:p>
       <w:pPr>
-        <w:spacing w:before="0" w:after="100"/>
-        <w:keepLines/>
-        <w:keepNext/>
+        <w:spacing w:after="160"/>
+      </w:pPr>
+      <w:r>
+        <w:t>☐  Blatt 24   Mein Rückblick auf das Prüfungsfenster · nach der Arbeit</w:t>
+      </w:r>
+    </w:p>
+    <w:p>
+      <w:pPr>
+        <w:shd w:fill="EEF2F4"/>
       </w:pPr>
       <w:r>
         <w:rPr>
           <w:b/>
-          <w:color w:val="D97A4A"/>
-          <w:sz w:val="28"/>
         </w:rPr>
-        <w:t>Unsere Wünsche für die neue Schule</w:t>
+        <w:t xml:space="preserve">Halt nach Blatt 19: </w:t>
+      </w:r>
+      <w:r>
+        <w:t>Prüfe deinen eigenen Brief mit dem Kompetenzcheck. Besprich eine passende nächste Übung mit der Lehrkraft.</w:t>
+      </w:r>
+    </w:p>
+    <w:p>
+      <w:r>
+        <w:t>Blatt 14 und 15 sowie alle Zusätze sind freiwillig. Brauchst du Blatt 17 nicht, gehe zu Blatt 18. Projekte wählst du freiwillig nach der Probearbeit.</w:t>
       </w:r>
     </w:p>
     <w:p>
       <w:pPr>
-        <w:spacing w:before="20" w:after="60"/>
-        <w:keepLines/>
-        <w:keepNext/>
+        <w:pStyle w:val="Heading1"/>
+      </w:pPr>
+      <w:r>
+        <w:t>Vor deiner Arbeit</w:t>
+      </w:r>
+    </w:p>
+    <w:p>
+      <w:r>
+        <w:t>☐  Du hast die Probearbeit geschrieben und besprochen.</w:t>
+        <w:br/>
+        <w:t>☐  Du hast deinen Brief mit dem Kompetenzcheck geprüft.</w:t>
+        <w:br/>
+        <w:t>☐  Du weißt, was du schon kannst und noch üben möchtest.</w:t>
+      </w:r>
+    </w:p>
+    <w:p>
+      <w:r>
+        <w:t>Dein nächster Schritt: __________________________________</w:t>
+        <w:br/>
+        <w:t>_____________________________________________________</w:t>
+      </w:r>
+    </w:p>
+    <w:p>
+      <w:r>
+        <w:t>Dein Termin für die Arbeit: ______________________________</w:t>
+        <w:br/>
+        <w:t>Besprochen mit: _______________________________________</w:t>
+      </w:r>
+    </w:p>
+    <w:p>
+      <w:pPr>
+        <w:shd w:fill="EEF2F4"/>
       </w:pPr>
       <w:r>
         <w:rPr>
           <w:b/>
-          <w:color w:val="3E5668"/>
-          <w:sz w:val="28"/>
         </w:rPr>
-        <w:t>Blätter 13–24</w:t>
-      </w:r>
-    </w:p>
-    <w:p>
-      <w:pPr>
-        <w:spacing w:before="0" w:after="100" w:line="240" w:lineRule="auto"/>
-        <w:ind w:left="57" w:right="57"/>
-        <w:keepLines/>
-        <w:pBdr>
-          <w:bottom w:val="single" w:sz="4" w:space="3" w:color="CED7DC"/>
-        </w:pBdr>
-      </w:pPr>
-      <w:r>
-        <w:rPr>
-          <w:rFonts w:ascii="Aptos" w:hAnsi="Aptos"/>
-          <w:color w:val="222222"/>
-          <w:sz w:val="28"/>
-        </w:rPr>
-        <w:t xml:space="preserve">☐  </w:t>
+        <w:t xml:space="preserve">Hilfen sind erlaubt: </w:t>
       </w:r>
       <w:r>
-        <w:rPr>
-          <w:b/>
-          <w:color w:val="3E5668"/>
-          <w:sz w:val="28"/>
-        </w:rPr>
-        <w:t>Blatt 13</w:t>
-      </w:r>
-      <w:r>
-        <w:rPr>
-          <w:color w:val="222222"/>
-          <w:sz w:val="28"/>
-        </w:rPr>
-        <w:t xml:space="preserve">  Mein Wunsch für den Schulalltag</w:t>
-      </w:r>
-    </w:p>
-    <w:p>
-      <w:pPr>
-        <w:spacing w:before="0" w:after="40" w:line="240" w:lineRule="auto"/>
-        <w:ind w:left="57" w:right="57"/>
-        <w:keepLines/>
-        <w:keepNext/>
-      </w:pPr>
-      <w:r>
-        <w:rPr>
-          <w:rFonts w:ascii="Aptos" w:hAnsi="Aptos"/>
-          <w:color w:val="222222"/>
-          <w:sz w:val="28"/>
-        </w:rPr>
-        <w:t xml:space="preserve">☐  </w:t>
-      </w:r>
-      <w:r>
-        <w:rPr>
-          <w:b/>
-          <w:color w:val="3E5668"/>
-          <w:sz w:val="28"/>
-        </w:rPr>
-        <w:t>Blatt 14</w:t>
-      </w:r>
-      <w:r>
-        <w:rPr>
-          <w:rFonts w:ascii="Segoe UI Emoji" w:hAnsi="Segoe UI Emoji"/>
-          <w:color w:val="D97A4A"/>
-          <w:sz w:val="24"/>
-        </w:rPr>
-        <w:t xml:space="preserve">   🔼  </w:t>
-      </w:r>
-      <w:r>
-        <w:rPr>
-          <w:rFonts w:ascii="Aptos" w:hAnsi="Aptos"/>
-          <w:b/>
-          <w:color w:val="D97A4A"/>
-          <w:sz w:val="24"/>
-        </w:rPr>
-        <w:t>Noch einen Schritt – freiwillig</w:t>
-      </w:r>
-    </w:p>
-    <w:p>
-      <w:pPr>
-        <w:spacing w:before="0" w:after="100" w:line="240" w:lineRule="auto"/>
-        <w:ind w:left="652" w:right="57"/>
-        <w:pBdr>
-          <w:bottom w:val="single" w:sz="4" w:space="3" w:color="CED7DC"/>
-        </w:pBdr>
-        <w:keepLines/>
-      </w:pPr>
-      <w:r>
-        <w:rPr>
-          <w:color w:val="222222"/>
-          <w:sz w:val="28"/>
-        </w:rPr>
-        <w:t>Einen Grund ergänzen</w:t>
-      </w:r>
-    </w:p>
-    <w:p>
-      <w:pPr>
-        <w:spacing w:before="0" w:after="40" w:line="240" w:lineRule="auto"/>
-        <w:ind w:left="57" w:right="57"/>
-        <w:keepLines/>
-        <w:keepNext/>
-      </w:pPr>
-      <w:r>
-        <w:rPr>
-          <w:rFonts w:ascii="Aptos" w:hAnsi="Aptos"/>
-          <w:color w:val="222222"/>
-          <w:sz w:val="28"/>
-        </w:rPr>
-        <w:t xml:space="preserve">☐  </w:t>
-      </w:r>
-      <w:r>
-        <w:rPr>
-          <w:b/>
-          <w:color w:val="3E5668"/>
-          <w:sz w:val="28"/>
-        </w:rPr>
-        <w:t>Blatt 15</w:t>
-      </w:r>
-      <w:r>
-        <w:rPr>
-          <w:rFonts w:ascii="Segoe UI Emoji" w:hAnsi="Segoe UI Emoji"/>
-          <w:color w:val="C58A00"/>
-          <w:sz w:val="24"/>
-        </w:rPr>
-        <w:t xml:space="preserve">   ⭐  </w:t>
-      </w:r>
-      <w:r>
-        <w:rPr>
-          <w:rFonts w:ascii="Aptos" w:hAnsi="Aptos"/>
-          <w:b/>
-          <w:color w:val="C58A00"/>
-          <w:sz w:val="24"/>
-        </w:rPr>
-        <w:t>Für Entdecker – freiwillig</w:t>
-      </w:r>
-    </w:p>
-    <w:p>
-      <w:pPr>
-        <w:spacing w:before="0" w:after="100" w:line="240" w:lineRule="auto"/>
-        <w:ind w:left="652" w:right="57"/>
-        <w:pBdr>
-          <w:bottom w:val="single" w:sz="4" w:space="3" w:color="CED7DC"/>
-        </w:pBdr>
-        <w:keepLines/>
-      </w:pPr>
-      <w:r>
-        <w:rPr>
-          <w:color w:val="222222"/>
-          <w:sz w:val="28"/>
-        </w:rPr>
-        <w:t>Auf ein Bedenken eingehen</w:t>
-      </w:r>
-    </w:p>
-    <w:p>
-      <w:pPr>
-        <w:spacing w:before="0" w:after="100" w:line="240" w:lineRule="auto"/>
-        <w:ind w:left="57" w:right="57"/>
-        <w:keepLines/>
-        <w:pBdr>
-          <w:bottom w:val="single" w:sz="4" w:space="3" w:color="CED7DC"/>
-        </w:pBdr>
-      </w:pPr>
-      <w:r>
-        <w:rPr>
-          <w:rFonts w:ascii="Aptos" w:hAnsi="Aptos"/>
-          <w:color w:val="222222"/>
-          <w:sz w:val="28"/>
-        </w:rPr>
-        <w:t xml:space="preserve">☐  </w:t>
-      </w:r>
-      <w:r>
-        <w:rPr>
-          <w:b/>
-          <w:color w:val="3E5668"/>
-          <w:sz w:val="28"/>
-        </w:rPr>
-        <w:t>Blatt 16</w:t>
-      </w:r>
-      <w:r>
-        <w:rPr>
-          <w:color w:val="222222"/>
-          <w:sz w:val="28"/>
-        </w:rPr>
-        <w:t xml:space="preserve">  Mein Schreibplan</w:t>
-      </w:r>
-    </w:p>
-    <w:p>
-      <w:pPr>
-        <w:spacing w:before="0" w:after="100" w:line="240" w:lineRule="auto"/>
-        <w:ind w:left="57" w:right="57"/>
-        <w:keepLines/>
-        <w:pBdr>
-          <w:bottom w:val="single" w:sz="4" w:space="3" w:color="CED7DC"/>
-        </w:pBdr>
-      </w:pPr>
-      <w:r>
-        <w:rPr>
-          <w:rFonts w:ascii="Aptos" w:hAnsi="Aptos"/>
-          <w:color w:val="222222"/>
-          <w:sz w:val="28"/>
-        </w:rPr>
-        <w:t xml:space="preserve">☐  </w:t>
-      </w:r>
-      <w:r>
-        <w:rPr>
-          <w:b/>
-          <w:color w:val="3E5668"/>
-          <w:sz w:val="28"/>
-        </w:rPr>
-        <w:t>Blatt 17</w:t>
-      </w:r>
-      <w:r>
-        <w:rPr>
-          <w:color w:val="222222"/>
-          <w:sz w:val="28"/>
-        </w:rPr>
-        <w:t xml:space="preserve">  Mein Briefgerüst</w:t>
-      </w:r>
-    </w:p>
-    <w:p>
-      <w:pPr>
-        <w:spacing w:before="0" w:after="100" w:line="240" w:lineRule="auto"/>
-        <w:ind w:left="57" w:right="57"/>
-        <w:keepLines/>
-        <w:pBdr>
-          <w:bottom w:val="single" w:sz="4" w:space="3" w:color="CED7DC"/>
-        </w:pBdr>
-      </w:pPr>
-      <w:r>
-        <w:rPr>
-          <w:rFonts w:ascii="Aptos" w:hAnsi="Aptos"/>
-          <w:color w:val="222222"/>
-          <w:sz w:val="28"/>
-        </w:rPr>
-        <w:t xml:space="preserve">☐  </w:t>
-      </w:r>
-      <w:r>
-        <w:rPr>
-          <w:b/>
-          <w:color w:val="3E5668"/>
-          <w:sz w:val="28"/>
-        </w:rPr>
-        <w:t>Blatt 18</w:t>
-      </w:r>
-      <w:r>
-        <w:rPr>
-          <w:color w:val="222222"/>
-          <w:sz w:val="28"/>
-        </w:rPr>
-        <w:t xml:space="preserve">  Mein erster Wunschbrief</w:t>
-      </w:r>
-    </w:p>
-    <w:p>
-      <w:pPr>
-        <w:spacing w:before="0" w:after="100" w:line="240" w:lineRule="auto"/>
-        <w:ind w:left="57" w:right="57"/>
-        <w:keepLines/>
-        <w:pBdr>
-          <w:bottom w:val="single" w:sz="4" w:space="3" w:color="CED7DC"/>
-        </w:pBdr>
-      </w:pPr>
-      <w:r>
-        <w:rPr>
-          <w:rFonts w:ascii="Aptos" w:hAnsi="Aptos"/>
-          <w:color w:val="222222"/>
-          <w:sz w:val="28"/>
-        </w:rPr>
-        <w:t xml:space="preserve">☐  </w:t>
-      </w:r>
-      <w:r>
-        <w:rPr>
-          <w:b/>
-          <w:color w:val="3E5668"/>
-          <w:sz w:val="28"/>
-        </w:rPr>
-        <w:t>Blatt 19</w:t>
-      </w:r>
-      <w:r>
-        <w:rPr>
-          <w:color w:val="222222"/>
-          <w:sz w:val="28"/>
-        </w:rPr>
-        <w:t xml:space="preserve">  Checkliste Wunschbrief</w:t>
-      </w:r>
-    </w:p>
-    <w:p>
-      <w:pPr>
-        <w:spacing w:before="0" w:after="100" w:line="240" w:lineRule="auto"/>
-        <w:ind w:left="57" w:right="57"/>
-        <w:keepLines/>
-        <w:pBdr>
-          <w:bottom w:val="single" w:sz="4" w:space="3" w:color="CED7DC"/>
-        </w:pBdr>
-      </w:pPr>
-      <w:r>
-        <w:rPr>
-          <w:rFonts w:ascii="Aptos" w:hAnsi="Aptos"/>
-          <w:color w:val="222222"/>
-          <w:sz w:val="28"/>
-        </w:rPr>
-        <w:t xml:space="preserve">☐  </w:t>
-      </w:r>
-      <w:r>
-        <w:rPr>
-          <w:b/>
-          <w:color w:val="3E5668"/>
-          <w:sz w:val="28"/>
-        </w:rPr>
-        <w:t>Blatt 20</w:t>
-      </w:r>
-      <w:r>
-        <w:rPr>
-          <w:color w:val="222222"/>
-          <w:sz w:val="28"/>
-        </w:rPr>
-        <w:t xml:space="preserve">  Mein Brief wird besser</w:t>
-      </w:r>
-    </w:p>
-    <w:p>
-      <w:pPr>
-        <w:spacing w:before="0" w:after="100" w:line="240" w:lineRule="auto"/>
-        <w:ind w:left="57" w:right="57"/>
-        <w:keepLines/>
-        <w:pBdr>
-          <w:bottom w:val="single" w:sz="4" w:space="3" w:color="CED7DC"/>
-        </w:pBdr>
-      </w:pPr>
-      <w:r>
-        <w:rPr>
-          <w:rFonts w:ascii="Aptos" w:hAnsi="Aptos"/>
-          <w:color w:val="222222"/>
-          <w:sz w:val="28"/>
-        </w:rPr>
-        <w:t xml:space="preserve">☐  </w:t>
-      </w:r>
-      <w:r>
-        <w:rPr>
-          <w:b/>
-          <w:color w:val="3E5668"/>
-          <w:sz w:val="28"/>
-        </w:rPr>
-        <w:t>Blatt 21</w:t>
-      </w:r>
-      <w:r>
-        <w:rPr>
-          <w:color w:val="222222"/>
-          <w:sz w:val="28"/>
-        </w:rPr>
-        <w:t xml:space="preserve">  Meine Probearbeit</w:t>
-      </w:r>
-    </w:p>
-    <w:p>
-      <w:pPr>
-        <w:spacing w:before="0" w:after="100" w:line="240" w:lineRule="auto"/>
-        <w:ind w:left="57" w:right="57"/>
-        <w:keepLines/>
-        <w:pBdr>
-          <w:bottom w:val="single" w:sz="4" w:space="3" w:color="CED7DC"/>
-        </w:pBdr>
-      </w:pPr>
-      <w:r>
-        <w:rPr>
-          <w:rFonts w:ascii="Aptos" w:hAnsi="Aptos"/>
-          <w:color w:val="222222"/>
-          <w:sz w:val="28"/>
-        </w:rPr>
-        <w:t xml:space="preserve">☐  </w:t>
-      </w:r>
-      <w:r>
-        <w:rPr>
-          <w:b/>
-          <w:color w:val="3E5668"/>
-          <w:sz w:val="28"/>
-        </w:rPr>
-        <w:t>Blatt 22</w:t>
-      </w:r>
-      <w:r>
-        <w:rPr>
-          <w:color w:val="222222"/>
-          <w:sz w:val="28"/>
-        </w:rPr>
-        <w:t xml:space="preserve">  Bin ich bereit?</w:t>
-      </w:r>
-    </w:p>
-    <w:p>
-      <w:pPr>
-        <w:spacing w:before="0" w:after="100" w:line="240" w:lineRule="auto"/>
-        <w:ind w:left="57" w:right="57"/>
-        <w:keepLines/>
-        <w:pBdr>
-          <w:bottom w:val="single" w:sz="4" w:space="3" w:color="CED7DC"/>
-        </w:pBdr>
-      </w:pPr>
-      <w:r>
-        <w:rPr>
-          <w:rFonts w:ascii="Aptos" w:hAnsi="Aptos"/>
-          <w:color w:val="222222"/>
-          <w:sz w:val="28"/>
-        </w:rPr>
-        <w:t xml:space="preserve">☐  </w:t>
-      </w:r>
-      <w:r>
-        <w:rPr>
-          <w:b/>
-          <w:color w:val="3E5668"/>
-          <w:sz w:val="28"/>
-        </w:rPr>
-        <w:t>Blatt 23</w:t>
-      </w:r>
-      <w:r>
-        <w:rPr>
-          <w:color w:val="222222"/>
-          <w:sz w:val="28"/>
-        </w:rPr>
-        <w:t xml:space="preserve">  Mein Übungsweg bis zur Arbeit</w:t>
-      </w:r>
-    </w:p>
-    <w:p>
-      <w:pPr>
-        <w:spacing w:before="0" w:after="100" w:line="240" w:lineRule="auto"/>
-        <w:ind w:left="57" w:right="57"/>
-        <w:keepLines/>
-        <w:pBdr>
-          <w:bottom w:val="single" w:sz="4" w:space="3" w:color="CED7DC"/>
-        </w:pBdr>
-      </w:pPr>
-      <w:r>
-        <w:rPr>
-          <w:rFonts w:ascii="Aptos" w:hAnsi="Aptos"/>
-          <w:color w:val="222222"/>
-          <w:sz w:val="28"/>
-        </w:rPr>
-        <w:t xml:space="preserve">☐  </w:t>
-      </w:r>
-      <w:r>
-        <w:rPr>
-          <w:b/>
-          <w:color w:val="3E5668"/>
-          <w:sz w:val="28"/>
-        </w:rPr>
-        <w:t>Blatt 24</w:t>
-      </w:r>
-      <w:r>
-        <w:rPr>
-          <w:color w:val="222222"/>
-          <w:sz w:val="28"/>
-        </w:rPr>
-        <w:t xml:space="preserve">  Mein Rückblick auf das Prüfungsfenster</w:t>
-      </w:r>
-    </w:p>
-    <w:p>
-      <w:pPr>
-        <w:spacing w:before="140" w:after="100"/>
-        <w:ind w:left="85" w:right="85"/>
-        <w:shd w:fill="EDF2F5"/>
-        <w:pBdr>
-          <w:top w:val="single" w:sz="7" w:space="3" w:color="3E5668"/>
-          <w:bottom w:val="single" w:sz="7" w:space="3" w:color="3E5668"/>
-        </w:pBdr>
-        <w:keepLines/>
-      </w:pPr>
-      <w:r>
-        <w:rPr>
-          <w:b/>
-          <w:color w:val="3E5668"/>
-          <w:sz w:val="26"/>
-        </w:rPr>
-        <w:t xml:space="preserve">Mein Termin für die Lernerfolgskontrolle:  </w:t>
-      </w:r>
-      <w:r>
-        <w:rPr>
-          <w:sz w:val="26"/>
-        </w:rPr>
-        <w:t>____________________________</w:t>
-      </w:r>
-    </w:p>
-    <w:p>
-      <w:pPr>
-        <w:spacing w:after="40"/>
-        <w:ind w:left="113"/>
-        <w:keepLines/>
-        <w:keepNext/>
-      </w:pPr>
-      <w:r>
-        <w:rPr>
-          <w:b/>
-          <w:color w:val="3E5668"/>
-          <w:sz w:val="25"/>
-        </w:rPr>
-        <w:t>Vor meinem Termin prüfe ich:</w:t>
-      </w:r>
-    </w:p>
-    <w:p>
-      <w:pPr>
-        <w:spacing w:after="40"/>
-        <w:ind w:left="142"/>
-        <w:keepLines/>
-      </w:pPr>
-      <w:r>
-        <w:rPr>
-          <w:sz w:val="24"/>
-        </w:rPr>
-        <w:t>☐  Ich habe meine Probearbeit geschrieben.</w:t>
-      </w:r>
-    </w:p>
-    <w:p>
-      <w:pPr>
-        <w:spacing w:after="40"/>
-        <w:ind w:left="142"/>
-        <w:keepLines/>
-      </w:pPr>
-      <w:r>
-        <w:rPr>
-          <w:sz w:val="24"/>
-        </w:rPr>
-        <w:t>☐  Ich habe meinen Brief mit der Checkliste geprüft.</w:t>
-      </w:r>
-    </w:p>
-    <w:p>
-      <w:pPr>
-        <w:spacing w:after="40"/>
-        <w:ind w:left="142"/>
-        <w:keepLines/>
-      </w:pPr>
-      <w:r>
-        <w:rPr>
-          <w:sz w:val="24"/>
-        </w:rPr>
-        <w:t>☐  Ich weiß, was ich vor der Arbeit noch üben möchte.</w:t>
+        <w:t>Nutze in der Übung die ausgedruckten Hilfen oder frage nach. Hilfe zu nutzen ist kein Zeichen für wenig Können.</w:t>
       </w:r>
     </w:p>
     <w:sectPr>
       <w:footerReference w:type="default" r:id="rId9"/>
       <w:pgSz w:w="11906" w:h="16838"/>
-      <w:pgMar w:top="765" w:right="879" w:bottom="680" w:left="879" w:header="283" w:footer="312" w:gutter="0"/>
+      <w:pgMar w:top="737" w:right="850" w:bottom="737" w:left="850" w:header="720" w:footer="720" w:gutter="0"/>
       <w:cols w:space="720"/>
       <w:docGrid w:linePitch="360"/>
     </w:sectPr>
@@ -1280,16 +379,19 @@
   <w:p>
     <w:pPr>
       <w:pStyle w:val="Footer"/>
-      <w:jc w:val="center"/>
     </w:pPr>
     <w:r>
       <w:rPr>
-        <w:rFonts w:ascii="Aptos" w:hAnsi="Aptos"/>
-        <w:color w:val="777777"/>
-        <w:sz w:val="17"/>
-      </w:rPr>
-      <w:t>Mein Lernweg · zentrale Übersicht über die Reihe</w:t>
+        <w:sz w:val="20"/>
+      </w:rPr>
+      <w:t xml:space="preserve">Wunschbriefe · Fassung 3 · </w:t>
     </w:r>
+    <w:r>
+      <w:rPr>
+        <w:sz w:val="20"/>
+      </w:rPr>
+    </w:r>
+    <w:fldSimple w:instr="PAGE"/>
   </w:p>
 </w:ftr>
 </file>
@@ -1658,12 +760,13 @@
     <w:qFormat/>
     <w:rsid w:val="00FC693F"/>
     <w:pPr>
-      <w:spacing w:after="0" w:line="247" w:lineRule="auto"/>
+      <w:keepNext w:val="0"/>
+      <w:spacing w:before="0" w:after="120" w:line="252" w:lineRule="auto"/>
     </w:pPr>
     <w:rPr>
-      <w:rFonts w:ascii="Aptos" w:hAnsi="Aptos" w:eastAsia="Aptos"/>
-      <w:color w:val="222222"/>
-      <w:sz w:val="24"/>
+      <w:rFonts w:ascii="Arial" w:hAnsi="Arial"/>
+      <w:color w:val="24313A"/>
+      <w:sz w:val="28"/>
     </w:rPr>
   </w:style>
   <w:style w:type="paragraph" w:styleId="Header">
@@ -1721,15 +824,15 @@
     <w:pPr>
       <w:keepNext/>
       <w:keepLines/>
-      <w:spacing w:before="480" w:after="0"/>
+      <w:spacing w:before="0" w:after="120" w:line="252" w:lineRule="auto"/>
       <w:outlineLvl w:val="0"/>
     </w:pPr>
     <w:rPr>
-      <w:rFonts w:asciiTheme="majorHAnsi" w:eastAsiaTheme="majorEastAsia" w:hAnsiTheme="majorHAnsi" w:cstheme="majorBidi"/>
+      <w:rFonts w:asciiTheme="majorHAnsi" w:eastAsiaTheme="majorEastAsia" w:hAnsiTheme="majorHAnsi" w:cstheme="majorBidi" w:ascii="Arial" w:hAnsi="Arial"/>
       <w:b/>
       <w:bCs/>
-      <w:color w:val="365F91" w:themeColor="accent1" w:themeShade="BF"/>
-      <w:sz w:val="28"/>
+      <w:color w:val="24313A"/>
+      <w:sz w:val="34"/>
       <w:szCs w:val="28"/>
     </w:rPr>
   </w:style>
@@ -1745,15 +848,15 @@
     <w:pPr>
       <w:keepNext/>
       <w:keepLines/>
-      <w:spacing w:before="200" w:after="0"/>
+      <w:spacing w:before="0" w:after="120" w:line="252" w:lineRule="auto"/>
       <w:outlineLvl w:val="1"/>
     </w:pPr>
     <w:rPr>
-      <w:rFonts w:asciiTheme="majorHAnsi" w:eastAsiaTheme="majorEastAsia" w:hAnsiTheme="majorHAnsi" w:cstheme="majorBidi"/>
+      <w:rFonts w:asciiTheme="majorHAnsi" w:eastAsiaTheme="majorEastAsia" w:hAnsiTheme="majorHAnsi" w:cstheme="majorBidi" w:ascii="Arial" w:hAnsi="Arial"/>
       <w:b/>
       <w:bCs/>
-      <w:color w:val="4F81BD" w:themeColor="accent1"/>
-      <w:sz w:val="26"/>
+      <w:color w:val="24313A"/>
+      <w:sz w:val="28"/>
       <w:szCs w:val="26"/>
     </w:rPr>
   </w:style>
@@ -2007,18 +1110,19 @@
     <w:qFormat/>
     <w:rsid w:val="00FC693F"/>
     <w:pPr>
+      <w:keepNext/>
       <w:pBdr>
         <w:bottom w:val="single" w:sz="8" w:space="4" w:color="4F81BD" w:themeColor="accent1"/>
       </w:pBdr>
-      <w:spacing w:after="300" w:line="240" w:lineRule="auto"/>
+      <w:spacing w:after="120" w:line="252" w:lineRule="auto" w:before="0"/>
       <w:contextualSpacing/>
     </w:pPr>
     <w:rPr>
-      <w:rFonts w:asciiTheme="majorHAnsi" w:eastAsiaTheme="majorEastAsia" w:hAnsiTheme="majorHAnsi" w:cstheme="majorBidi"/>
-      <w:color w:val="17365D" w:themeColor="text2" w:themeShade="BF"/>
+      <w:rFonts w:asciiTheme="majorHAnsi" w:eastAsiaTheme="majorEastAsia" w:hAnsiTheme="majorHAnsi" w:cstheme="majorBidi" w:ascii="Arial" w:hAnsi="Arial"/>
+      <w:color w:val="24313A"/>
       <w:spacing w:val="5"/>
       <w:kern w:val="28"/>
-      <w:sz w:val="52"/>
+      <w:sz w:val="44"/>
       <w:szCs w:val="52"/>
     </w:rPr>
   </w:style>

</xml_diff>